<commit_message>
resume: clarify current academic appointments
</commit_message>
<xml_diff>
--- a/resume/executive-resume.docx
+++ b/resume/executive-resume.docx
@@ -480,13 +480,23 @@
     </w:p>
     <w:p>
       <w:pPr>
-        <w:pStyle w:val="ListBullet"/>
+        <w:keepNext/>
       </w:pPr>
       <w:r>
         <w:rPr>
           <w:b w:val="0"/>
         </w:rPr>
-        <w:t>Adjunct Faculty Member, ICT program, Mahidol University | September 2026 - Present.</w:t>
+      </w:r>
+      <w:r>
+        <w:rPr>
+          <w:b/>
+        </w:rPr>
+        <w:t>Current Adjunct Faculty Appointments</w:t>
+      </w:r>
+      <w:r>
+        <w:rPr>
+          <w:b w:val="0"/>
+        </w:rPr>
       </w:r>
     </w:p>
     <w:p>
@@ -497,7 +507,18 @@
         <w:rPr>
           <w:b w:val="0"/>
         </w:rPr>
-        <w:t>Adjunct faculty at KMUTNB (2020 - Present) and Panyapiwat Institute of Management (2021 - Present), teaching statistical data science, big-data analysis, and business analytics and governance.</w:t>
+      </w:r>
+      <w:r>
+        <w:rPr>
+          <w:b/>
+        </w:rPr>
+        <w:t>Mahidol University | September 2026 - Present:</w:t>
+      </w:r>
+      <w:r>
+        <w:rPr>
+          <w:b w:val="0"/>
+        </w:rPr>
+        <w:t xml:space="preserve"> ICT program.</w:t>
       </w:r>
     </w:p>
     <w:p>
@@ -508,7 +529,68 @@
         <w:rPr>
           <w:b w:val="0"/>
         </w:rPr>
-        <w:t>Co-authored a 2025 CLOSER paper on decentralized data strategies for virtual banking.</w:t>
+      </w:r>
+      <w:r>
+        <w:rPr>
+          <w:b/>
+        </w:rPr>
+        <w:t>Panyapiwat Institute of Management | 2021 - Present:</w:t>
+      </w:r>
+      <w:r>
+        <w:rPr>
+          <w:b w:val="0"/>
+        </w:rPr>
+        <w:t xml:space="preserve"> Business analytics and data governance.</w:t>
+      </w:r>
+    </w:p>
+    <w:p>
+      <w:pPr>
+        <w:pStyle w:val="ListBullet"/>
+      </w:pPr>
+      <w:r>
+        <w:rPr>
+          <w:b w:val="0"/>
+        </w:rPr>
+      </w:r>
+      <w:r>
+        <w:rPr>
+          <w:b/>
+        </w:rPr>
+        <w:t>King Mongkut's University of Technology North Bangkok | 2020 - Present:</w:t>
+      </w:r>
+      <w:r>
+        <w:rPr>
+          <w:b w:val="0"/>
+        </w:rPr>
+        <w:t xml:space="preserve"> Statistical data science and big-data analysis.</w:t>
+      </w:r>
+    </w:p>
+    <w:p>
+      <w:pPr/>
+      <w:r>
+        <w:rPr>
+          <w:b w:val="0"/>
+        </w:rPr>
+      </w:r>
+      <w:r>
+        <w:rPr>
+          <w:b/>
+        </w:rPr>
+        <w:t>Selected Research:</w:t>
+      </w:r>
+      <w:r>
+        <w:rPr>
+          <w:b w:val="0"/>
+        </w:rPr>
+        <w:t xml:space="preserve"> Co-authored a 2025 CLOSER paper on decentralized data strategies for virtual banking.</w:t>
+      </w:r>
+    </w:p>
+    <w:p>
+      <w:pPr>
+        <w:pStyle w:val="Heading1"/>
+      </w:pPr>
+      <w:r>
+        <w:t>Earlier Academic and Consulting Experience</w:t>
       </w:r>
     </w:p>
     <w:p>

</xml_diff>

<commit_message>
resume: cite selected paper with direct DOI link
</commit_message>
<xml_diff>
--- a/resume/executive-resume.docx
+++ b/resume/executive-resume.docx
@@ -576,13 +576,28 @@
         <w:rPr>
           <w:b/>
         </w:rPr>
-        <w:t>Selected Research:</w:t>
+        <w:t>Selected Publication:</w:t>
       </w:r>
       <w:r>
         <w:rPr>
           <w:b w:val="0"/>
         </w:rPr>
-        <w:t xml:space="preserve"> Co-authored a 2025 CLOSER paper on decentralized data strategies for virtual banking.</w:t>
+        <w:t xml:space="preserve"> W. A. Pongpech and P. Putthapipat (2025). "Framework for Decentralized Data Strategies in Virtual Banking: Navigating Scalability, Innovation, and Regulatory Challenges in Thailand." Proceedings of the 15th International Conference on Cloud Computing and Services Science (CLOSER), pp. 111-118. </w:t>
+      </w:r>
+      <w:hyperlink r:id="rId10">
+        <w:r>
+          <w:rPr>
+            <w:b w:val="0"/>
+            <w:u w:val="single"/>
+          </w:rPr>
+          <w:t>DOI: 10.5220/0013194500003950</w:t>
+        </w:r>
+      </w:hyperlink>
+      <w:r>
+        <w:rPr>
+          <w:b w:val="0"/>
+        </w:rPr>
+        <w:t>.</w:t>
       </w:r>
     </w:p>
     <w:p>

</xml_diff>